<commit_message>
style: enhanced word files with visual cover page, logos, headers, footers and live github repo screenshot
</commit_message>
<xml_diff>
--- a/Practical File/Practical-1,2-WDF-25DCS058-Code.docx
+++ b/Practical File/Practical-1,2-WDF-25DCS058-Code.docx
@@ -2,6 +2,227 @@
 <file path=word/document.xml><?xml version="1.0" encoding="utf-8"?>
 <w:document xmlns:wpc="http://schemas.microsoft.com/office/word/2010/wordprocessingCanvas" xmlns:mo="http://schemas.microsoft.com/office/mac/office/2008/main" xmlns:mc="http://schemas.openxmlformats.org/markup-compatibility/2006" xmlns:mv="urn:schemas-microsoft-com:mac:vml" xmlns:o="urn:schemas-microsoft-com:office:office" xmlns:r="http://schemas.openxmlformats.org/officeDocument/2006/relationships" xmlns:m="http://schemas.openxmlformats.org/officeDocument/2006/math" xmlns:v="urn:schemas-microsoft-com:vml" xmlns:wp14="http://schemas.microsoft.com/office/word/2010/wordprocessingDrawing" xmlns:wp="http://schemas.openxmlformats.org/drawingml/2006/wordprocessingDrawing" xmlns:w10="urn:schemas-microsoft-com:office:word" xmlns:w="http://schemas.openxmlformats.org/wordprocessingml/2006/main" xmlns:w14="http://schemas.microsoft.com/office/word/2010/wordml" xmlns:wpg="http://schemas.microsoft.com/office/word/2010/wordprocessingGroup" xmlns:wpi="http://schemas.microsoft.com/office/word/2010/wordprocessingInk" xmlns:wne="http://schemas.microsoft.com/office/word/2006/wordml" xmlns:wps="http://schemas.microsoft.com/office/word/2010/wordprocessingShape" mc:Ignorable="w14 wp14">
   <w:body>
+    <w:tbl>
+      <w:tblPr>
+        <w:tblW w:type="auto" w:w="0"/>
+        <w:jc w:val="center"/>
+        <w:tblLayout w:type="fixed"/>
+        <w:tblLook w:firstColumn="1" w:firstRow="1" w:lastColumn="0" w:lastRow="0" w:noHBand="0" w:noVBand="1" w:val="04A0"/>
+      </w:tblPr>
+      <w:tblGrid>
+        <w:gridCol w:w="4320"/>
+        <w:gridCol w:w="4320"/>
+      </w:tblGrid>
+      <w:tr>
+        <w:tc>
+          <w:tcPr>
+            <w:tcW w:type="dxa" w:w="4608"/>
+          </w:tcPr>
+          <w:p>
+            <w:pPr>
+              <w:jc w:val="right"/>
+            </w:pPr>
+            <w:r>
+              <w:drawing>
+                <wp:inline xmlns:a="http://schemas.openxmlformats.org/drawingml/2006/main" xmlns:pic="http://schemas.openxmlformats.org/drawingml/2006/picture">
+                  <wp:extent cx="1005840" cy="436403"/>
+                  <wp:docPr id="1" name="Picture 1"/>
+                  <wp:cNvGraphicFramePr>
+                    <a:graphicFrameLocks noChangeAspect="1"/>
+                  </wp:cNvGraphicFramePr>
+                  <a:graphic>
+                    <a:graphicData uri="http://schemas.openxmlformats.org/drawingml/2006/picture">
+                      <pic:pic>
+                        <pic:nvPicPr>
+                          <pic:cNvPr id="0" name="depstar_logo.png"/>
+                          <pic:cNvPicPr/>
+                        </pic:nvPicPr>
+                        <pic:blipFill>
+                          <a:blip r:embed="rId9"/>
+                          <a:stretch>
+                            <a:fillRect/>
+                          </a:stretch>
+                        </pic:blipFill>
+                        <pic:spPr>
+                          <a:xfrm>
+                            <a:off x="0" y="0"/>
+                            <a:ext cx="1005840" cy="436403"/>
+                          </a:xfrm>
+                          <a:prstGeom prst="rect"/>
+                        </pic:spPr>
+                      </pic:pic>
+                    </a:graphicData>
+                  </a:graphic>
+                </wp:inline>
+              </w:drawing>
+            </w:r>
+          </w:p>
+        </w:tc>
+        <w:tc>
+          <w:tcPr>
+            <w:tcW w:type="dxa" w:w="4608"/>
+          </w:tcPr>
+          <w:p>
+            <w:pPr>
+              <w:jc w:val="left"/>
+            </w:pPr>
+            <w:r>
+              <w:drawing>
+                <wp:inline xmlns:a="http://schemas.openxmlformats.org/drawingml/2006/main" xmlns:pic="http://schemas.openxmlformats.org/drawingml/2006/picture">
+                  <wp:extent cx="3017520" cy="3081496"/>
+                  <wp:docPr id="2" name="Picture 2"/>
+                  <wp:cNvGraphicFramePr>
+                    <a:graphicFrameLocks noChangeAspect="1"/>
+                  </wp:cNvGraphicFramePr>
+                  <a:graphic>
+                    <a:graphicData uri="http://schemas.openxmlformats.org/drawingml/2006/picture">
+                      <pic:pic>
+                        <pic:nvPicPr>
+                          <pic:cNvPr id="0" name="charusat_logo.png"/>
+                          <pic:cNvPicPr/>
+                        </pic:nvPicPr>
+                        <pic:blipFill>
+                          <a:blip r:embed="rId10"/>
+                          <a:stretch>
+                            <a:fillRect/>
+                          </a:stretch>
+                        </pic:blipFill>
+                        <pic:spPr>
+                          <a:xfrm>
+                            <a:off x="0" y="0"/>
+                            <a:ext cx="3017520" cy="3081496"/>
+                          </a:xfrm>
+                          <a:prstGeom prst="rect"/>
+                        </pic:spPr>
+                      </pic:pic>
+                    </a:graphicData>
+                  </a:graphic>
+                </wp:inline>
+              </w:drawing>
+            </w:r>
+          </w:p>
+        </w:tc>
+      </w:tr>
+    </w:tbl>
+    <w:p>
+      <w:pPr>
+        <w:spacing w:before="600"/>
+      </w:pPr>
+    </w:p>
+    <w:p>
+      <w:pPr>
+        <w:spacing w:after="240"/>
+        <w:jc w:val="center"/>
+      </w:pPr>
+      <w:r>
+        <w:rPr>
+          <w:rFonts w:ascii="Calibri" w:hAnsi="Calibri"/>
+          <w:b/>
+          <w:i w:val="0"/>
+          <w:color w:val="1B365D"/>
+          <w:sz w:val="48"/>
+        </w:rPr>
+        <w:t>WEB DEVELOPMENT FRAMEWORKS</w:t>
+        <w:br/>
+        <w:t>(ITUE203)</w:t>
+      </w:r>
+    </w:p>
+    <w:p>
+      <w:pPr>
+        <w:spacing w:after="800"/>
+        <w:jc w:val="center"/>
+      </w:pPr>
+      <w:r>
+        <w:rPr>
+          <w:rFonts w:ascii="Calibri" w:hAnsi="Calibri"/>
+          <w:b/>
+          <w:i w:val="0"/>
+          <w:color w:val="475569"/>
+          <w:sz w:val="30"/>
+        </w:rPr>
+        <w:t>COMBINED LAB PRACTICAL PORTFOLIO</w:t>
+        <w:br/>
+        <w:t>(HTML5 SOURCE CODES)</w:t>
+      </w:r>
+    </w:p>
+    <w:p>
+      <w:pPr>
+        <w:spacing w:after="800"/>
+        <w:jc w:val="center"/>
+        <w:pBdr>
+          <w:bottom w:val="single" w:sz="18" w:space="1" w:color="1B365D"/>
+        </w:pBdr>
+      </w:pPr>
+    </w:p>
+    <w:p>
+      <w:pPr>
+        <w:spacing w:after="120"/>
+        <w:jc w:val="center"/>
+      </w:pPr>
+      <w:r>
+        <w:rPr>
+          <w:rFonts w:ascii="Calibri" w:hAnsi="Calibri"/>
+          <w:b w:val="0"/>
+          <w:i/>
+          <w:color w:val="64748B"/>
+          <w:sz w:val="24"/>
+        </w:rPr>
+        <w:t>Submitted By:</w:t>
+      </w:r>
+    </w:p>
+    <w:p>
+      <w:pPr>
+        <w:spacing w:after="120"/>
+        <w:jc w:val="center"/>
+      </w:pPr>
+      <w:r>
+        <w:rPr>
+          <w:rFonts w:ascii="Calibri" w:hAnsi="Calibri"/>
+          <w:b/>
+          <w:i w:val="0"/>
+          <w:color w:val="0F172A"/>
+          <w:sz w:val="26"/>
+        </w:rPr>
+        <w:t>Name: RUDRA | Enrollment ID: 25DCS058</w:t>
+      </w:r>
+    </w:p>
+    <w:p>
+      <w:pPr>
+        <w:spacing w:after="80"/>
+        <w:jc w:val="center"/>
+      </w:pPr>
+      <w:r>
+        <w:rPr>
+          <w:rFonts w:ascii="Calibri" w:hAnsi="Calibri"/>
+          <w:b w:val="0"/>
+          <w:i w:val="0"/>
+          <w:color w:val="475569"/>
+          <w:sz w:val="22"/>
+        </w:rPr>
+        <w:t>Devang Patel Institute of Advance Technology &amp; Research (DEPSTAR)</w:t>
+      </w:r>
+    </w:p>
+    <w:p>
+      <w:pPr>
+        <w:spacing w:after="80"/>
+        <w:jc w:val="center"/>
+      </w:pPr>
+      <w:r>
+        <w:rPr>
+          <w:rFonts w:ascii="Calibri" w:hAnsi="Calibri"/>
+          <w:b w:val="0"/>
+          <w:i w:val="0"/>
+          <w:color w:val="475569"/>
+          <w:sz w:val="22"/>
+        </w:rPr>
+        <w:t>Charotar University of Science and Technology (CHARUSAT)</w:t>
+      </w:r>
+    </w:p>
+    <w:p>
+      <w:r>
+        <w:br w:type="page"/>
+      </w:r>
+    </w:p>
     <w:p>
       <w:pPr>
         <w:pStyle w:val="Heading1"/>
@@ -13,10 +234,10 @@
           <w:rFonts w:ascii="Calibri Light" w:hAnsi="Calibri Light"/>
           <w:b/>
           <w:i w:val="0"/>
-          <w:color w:val="0F172A"/>
+          <w:color w:val="1B365D"/>
           <w:sz w:val="36"/>
         </w:rPr>
-        <w:t>StudentHub Portal - Practical 2 HTML Source Code Document</w:t>
+        <w:t>HTML5 Source Code Repository</w:t>
       </w:r>
     </w:p>
     <w:p>
@@ -28,10 +249,10 @@
           <w:rFonts w:ascii="Calibri" w:hAnsi="Calibri"/>
           <w:b w:val="0"/>
           <w:i w:val="0"/>
-          <w:color w:val="000000"/>
+          <w:color w:val="334155"/>
           <w:sz w:val="22"/>
         </w:rPr>
-        <w:t>This document contains the complete, clean semantic HTML5 code for all 11 pages of the StudentHub portal. Note: The application is developed up to Practical 2 utilizing only standard HTML5 tags and accessibility patterns with zero CSS elements/styling.</w:t>
+        <w:t>This document compiles the full semantic HTML5 source code for all 11 pages of the StudentHub portal project. The layout and pages are created strictly using semantic tags with zero CSS elements in accordance with Practical 2 constraints.</w:t>
       </w:r>
     </w:p>
     <w:p>
@@ -45,8 +266,8 @@
           <w:rFonts w:ascii="Calibri Light" w:hAnsi="Calibri Light"/>
           <w:b/>
           <w:i w:val="0"/>
-          <w:color w:val="1E293B"/>
-          <w:sz w:val="28"/>
+          <w:color w:val="475569"/>
+          <w:sz w:val="26"/>
         </w:rPr>
         <w:t>Source Code: index.html (Home Page)</w:t>
       </w:r>
@@ -58,18 +279,19 @@
         <w:tblLook w:firstColumn="1" w:firstRow="1" w:lastColumn="0" w:lastRow="0" w:noHBand="0" w:noVBand="1" w:val="04A0"/>
       </w:tblPr>
       <w:tblGrid>
-        <w:gridCol w:w="8640"/>
+        <w:gridCol w:w="9360"/>
       </w:tblGrid>
       <w:tr>
         <w:tc>
           <w:tcPr>
-            <w:tcW w:type="dxa" w:w="8640"/>
-            <w:shd w:fill="F1F5F9"/>
+            <w:tcW w:type="dxa" w:w="9360"/>
+            <w:shd w:fill="F8FAFC"/>
             <w:tcBorders>
-              <w:top w:val="single" w:sz="4" w:space="0" w:color="CBD5E1"/>
-              <w:left w:val="single" w:sz="4" w:space="0" w:color="CBD5E1"/>
-              <w:bottom w:val="single" w:sz="4" w:space="0" w:color="CBD5E1"/>
-              <w:right w:val="single" w:sz="4" w:space="0" w:color="CBD5E1"/>
+              <w:top w:val="single" w:sz="4" w:space="0" w:color="E2E8F0"/>
+              <w:left w:val="single" w:sz="6" w:space="0" w:color="1B365D"/>
+              <!-- Deep blue left thick border -->
+              <w:bottom w:val="single" w:sz="4" w:space="0" w:color="E2E8F0"/>
+              <w:right w:val="single" w:sz="4" w:space="0" w:color="E2E8F0"/>
             </w:tcBorders>
           </w:tcPr>
           <w:p>
@@ -414,8 +636,8 @@
           <w:rFonts w:ascii="Calibri Light" w:hAnsi="Calibri Light"/>
           <w:b/>
           <w:i w:val="0"/>
-          <w:color w:val="1E293B"/>
-          <w:sz w:val="28"/>
+          <w:color w:val="475569"/>
+          <w:sz w:val="26"/>
         </w:rPr>
         <w:t>Source Code: pages/about.html (About Us Page)</w:t>
       </w:r>
@@ -427,18 +649,19 @@
         <w:tblLook w:firstColumn="1" w:firstRow="1" w:lastColumn="0" w:lastRow="0" w:noHBand="0" w:noVBand="1" w:val="04A0"/>
       </w:tblPr>
       <w:tblGrid>
-        <w:gridCol w:w="8640"/>
+        <w:gridCol w:w="9360"/>
       </w:tblGrid>
       <w:tr>
         <w:tc>
           <w:tcPr>
-            <w:tcW w:type="dxa" w:w="8640"/>
-            <w:shd w:fill="F1F5F9"/>
+            <w:tcW w:type="dxa" w:w="9360"/>
+            <w:shd w:fill="F8FAFC"/>
             <w:tcBorders>
-              <w:top w:val="single" w:sz="4" w:space="0" w:color="CBD5E1"/>
-              <w:left w:val="single" w:sz="4" w:space="0" w:color="CBD5E1"/>
-              <w:bottom w:val="single" w:sz="4" w:space="0" w:color="CBD5E1"/>
-              <w:right w:val="single" w:sz="4" w:space="0" w:color="CBD5E1"/>
+              <w:top w:val="single" w:sz="4" w:space="0" w:color="E2E8F0"/>
+              <w:left w:val="single" w:sz="6" w:space="0" w:color="1B365D"/>
+              <!-- Deep blue left thick border -->
+              <w:bottom w:val="single" w:sz="4" w:space="0" w:color="E2E8F0"/>
+              <w:right w:val="single" w:sz="4" w:space="0" w:color="E2E8F0"/>
             </w:tcBorders>
           </w:tcPr>
           <w:p>
@@ -842,8 +1065,8 @@
           <w:rFonts w:ascii="Calibri Light" w:hAnsi="Calibri Light"/>
           <w:b/>
           <w:i w:val="0"/>
-          <w:color w:val="1E293B"/>
-          <w:sz w:val="28"/>
+          <w:color w:val="475569"/>
+          <w:sz w:val="26"/>
         </w:rPr>
         <w:t>Source Code: pages/register.html (Student Registration Page)</w:t>
       </w:r>
@@ -855,18 +1078,19 @@
         <w:tblLook w:firstColumn="1" w:firstRow="1" w:lastColumn="0" w:lastRow="0" w:noHBand="0" w:noVBand="1" w:val="04A0"/>
       </w:tblPr>
       <w:tblGrid>
-        <w:gridCol w:w="8640"/>
+        <w:gridCol w:w="9360"/>
       </w:tblGrid>
       <w:tr>
         <w:tc>
           <w:tcPr>
-            <w:tcW w:type="dxa" w:w="8640"/>
-            <w:shd w:fill="F1F5F9"/>
+            <w:tcW w:type="dxa" w:w="9360"/>
+            <w:shd w:fill="F8FAFC"/>
             <w:tcBorders>
-              <w:top w:val="single" w:sz="4" w:space="0" w:color="CBD5E1"/>
-              <w:left w:val="single" w:sz="4" w:space="0" w:color="CBD5E1"/>
-              <w:bottom w:val="single" w:sz="4" w:space="0" w:color="CBD5E1"/>
-              <w:right w:val="single" w:sz="4" w:space="0" w:color="CBD5E1"/>
+              <w:top w:val="single" w:sz="4" w:space="0" w:color="E2E8F0"/>
+              <w:left w:val="single" w:sz="6" w:space="0" w:color="1B365D"/>
+              <!-- Deep blue left thick border -->
+              <w:bottom w:val="single" w:sz="4" w:space="0" w:color="E2E8F0"/>
+              <w:right w:val="single" w:sz="4" w:space="0" w:color="E2E8F0"/>
             </w:tcBorders>
           </w:tcPr>
           <w:p>
@@ -1429,8 +1653,8 @@
           <w:rFonts w:ascii="Calibri Light" w:hAnsi="Calibri Light"/>
           <w:b/>
           <w:i w:val="0"/>
-          <w:color w:val="1E293B"/>
-          <w:sz w:val="28"/>
+          <w:color w:val="475569"/>
+          <w:sz w:val="26"/>
         </w:rPr>
         <w:t>Source Code: pages/login.html (User Login Page)</w:t>
       </w:r>
@@ -1442,18 +1666,19 @@
         <w:tblLook w:firstColumn="1" w:firstRow="1" w:lastColumn="0" w:lastRow="0" w:noHBand="0" w:noVBand="1" w:val="04A0"/>
       </w:tblPr>
       <w:tblGrid>
-        <w:gridCol w:w="8640"/>
+        <w:gridCol w:w="9360"/>
       </w:tblGrid>
       <w:tr>
         <w:tc>
           <w:tcPr>
-            <w:tcW w:type="dxa" w:w="8640"/>
-            <w:shd w:fill="F1F5F9"/>
+            <w:tcW w:type="dxa" w:w="9360"/>
+            <w:shd w:fill="F8FAFC"/>
             <w:tcBorders>
-              <w:top w:val="single" w:sz="4" w:space="0" w:color="CBD5E1"/>
-              <w:left w:val="single" w:sz="4" w:space="0" w:color="CBD5E1"/>
-              <w:bottom w:val="single" w:sz="4" w:space="0" w:color="CBD5E1"/>
-              <w:right w:val="single" w:sz="4" w:space="0" w:color="CBD5E1"/>
+              <w:top w:val="single" w:sz="4" w:space="0" w:color="E2E8F0"/>
+              <w:left w:val="single" w:sz="6" w:space="0" w:color="1B365D"/>
+              <!-- Deep blue left thick border -->
+              <w:bottom w:val="single" w:sz="4" w:space="0" w:color="E2E8F0"/>
+              <w:right w:val="single" w:sz="4" w:space="0" w:color="E2E8F0"/>
             </w:tcBorders>
           </w:tcPr>
           <w:p>
@@ -1715,8 +1940,8 @@
           <w:rFonts w:ascii="Calibri Light" w:hAnsi="Calibri Light"/>
           <w:b/>
           <w:i w:val="0"/>
-          <w:color w:val="1E293B"/>
-          <w:sz w:val="28"/>
+          <w:color w:val="475569"/>
+          <w:sz w:val="26"/>
         </w:rPr>
         <w:t>Source Code: pages/dashboard.html (Student Dashboard Page)</w:t>
       </w:r>
@@ -1728,18 +1953,19 @@
         <w:tblLook w:firstColumn="1" w:firstRow="1" w:lastColumn="0" w:lastRow="0" w:noHBand="0" w:noVBand="1" w:val="04A0"/>
       </w:tblPr>
       <w:tblGrid>
-        <w:gridCol w:w="8640"/>
+        <w:gridCol w:w="9360"/>
       </w:tblGrid>
       <w:tr>
         <w:tc>
           <w:tcPr>
-            <w:tcW w:type="dxa" w:w="8640"/>
-            <w:shd w:fill="F1F5F9"/>
+            <w:tcW w:type="dxa" w:w="9360"/>
+            <w:shd w:fill="F8FAFC"/>
             <w:tcBorders>
-              <w:top w:val="single" w:sz="4" w:space="0" w:color="CBD5E1"/>
-              <w:left w:val="single" w:sz="4" w:space="0" w:color="CBD5E1"/>
-              <w:bottom w:val="single" w:sz="4" w:space="0" w:color="CBD5E1"/>
-              <w:right w:val="single" w:sz="4" w:space="0" w:color="CBD5E1"/>
+              <w:top w:val="single" w:sz="4" w:space="0" w:color="E2E8F0"/>
+              <w:left w:val="single" w:sz="6" w:space="0" w:color="1B365D"/>
+              <!-- Deep blue left thick border -->
+              <w:bottom w:val="single" w:sz="4" w:space="0" w:color="E2E8F0"/>
+              <w:right w:val="single" w:sz="4" w:space="0" w:color="E2E8F0"/>
             </w:tcBorders>
           </w:tcPr>
           <w:p>
@@ -2163,8 +2389,8 @@
           <w:rFonts w:ascii="Calibri Light" w:hAnsi="Calibri Light"/>
           <w:b/>
           <w:i w:val="0"/>
-          <w:color w:val="1E293B"/>
-          <w:sz w:val="28"/>
+          <w:color w:val="475569"/>
+          <w:sz w:val="26"/>
         </w:rPr>
         <w:t>Source Code: pages/events.html (Campus Events Page)</w:t>
       </w:r>
@@ -2176,18 +2402,19 @@
         <w:tblLook w:firstColumn="1" w:firstRow="1" w:lastColumn="0" w:lastRow="0" w:noHBand="0" w:noVBand="1" w:val="04A0"/>
       </w:tblPr>
       <w:tblGrid>
-        <w:gridCol w:w="8640"/>
+        <w:gridCol w:w="9360"/>
       </w:tblGrid>
       <w:tr>
         <w:tc>
           <w:tcPr>
-            <w:tcW w:type="dxa" w:w="8640"/>
-            <w:shd w:fill="F1F5F9"/>
+            <w:tcW w:type="dxa" w:w="9360"/>
+            <w:shd w:fill="F8FAFC"/>
             <w:tcBorders>
-              <w:top w:val="single" w:sz="4" w:space="0" w:color="CBD5E1"/>
-              <w:left w:val="single" w:sz="4" w:space="0" w:color="CBD5E1"/>
-              <w:bottom w:val="single" w:sz="4" w:space="0" w:color="CBD5E1"/>
-              <w:right w:val="single" w:sz="4" w:space="0" w:color="CBD5E1"/>
+              <w:top w:val="single" w:sz="4" w:space="0" w:color="E2E8F0"/>
+              <w:left w:val="single" w:sz="6" w:space="0" w:color="1B365D"/>
+              <!-- Deep blue left thick border -->
+              <w:bottom w:val="single" w:sz="4" w:space="0" w:color="E2E8F0"/>
+              <w:right w:val="single" w:sz="4" w:space="0" w:color="E2E8F0"/>
             </w:tcBorders>
           </w:tcPr>
           <w:p>
@@ -2608,8 +2835,8 @@
           <w:rFonts w:ascii="Calibri Light" w:hAnsi="Calibri Light"/>
           <w:b/>
           <w:i w:val="0"/>
-          <w:color w:val="1E293B"/>
-          <w:sz w:val="28"/>
+          <w:color w:val="475569"/>
+          <w:sz w:val="26"/>
         </w:rPr>
         <w:t>Source Code: pages/profile.html (Student Profile Page)</w:t>
       </w:r>
@@ -2621,18 +2848,19 @@
         <w:tblLook w:firstColumn="1" w:firstRow="1" w:lastColumn="0" w:lastRow="0" w:noHBand="0" w:noVBand="1" w:val="04A0"/>
       </w:tblPr>
       <w:tblGrid>
-        <w:gridCol w:w="8640"/>
+        <w:gridCol w:w="9360"/>
       </w:tblGrid>
       <w:tr>
         <w:tc>
           <w:tcPr>
-            <w:tcW w:type="dxa" w:w="8640"/>
-            <w:shd w:fill="F1F5F9"/>
+            <w:tcW w:type="dxa" w:w="9360"/>
+            <w:shd w:fill="F8FAFC"/>
             <w:tcBorders>
-              <w:top w:val="single" w:sz="4" w:space="0" w:color="CBD5E1"/>
-              <w:left w:val="single" w:sz="4" w:space="0" w:color="CBD5E1"/>
-              <w:bottom w:val="single" w:sz="4" w:space="0" w:color="CBD5E1"/>
-              <w:right w:val="single" w:sz="4" w:space="0" w:color="CBD5E1"/>
+              <w:top w:val="single" w:sz="4" w:space="0" w:color="E2E8F0"/>
+              <w:left w:val="single" w:sz="6" w:space="0" w:color="1B365D"/>
+              <!-- Deep blue left thick border -->
+              <w:bottom w:val="single" w:sz="4" w:space="0" w:color="E2E8F0"/>
+              <w:right w:val="single" w:sz="4" w:space="0" w:color="E2E8F0"/>
             </w:tcBorders>
           </w:tcPr>
           <w:p>
@@ -3040,8 +3268,8 @@
           <w:rFonts w:ascii="Calibri Light" w:hAnsi="Calibri Light"/>
           <w:b/>
           <w:i w:val="0"/>
-          <w:color w:val="1E293B"/>
-          <w:sz w:val="28"/>
+          <w:color w:val="475569"/>
+          <w:sz w:val="26"/>
         </w:rPr>
         <w:t>Source Code: pages/contact.html (Contact Support Page)</w:t>
       </w:r>
@@ -3053,18 +3281,19 @@
         <w:tblLook w:firstColumn="1" w:firstRow="1" w:lastColumn="0" w:lastRow="0" w:noHBand="0" w:noVBand="1" w:val="04A0"/>
       </w:tblPr>
       <w:tblGrid>
-        <w:gridCol w:w="8640"/>
+        <w:gridCol w:w="9360"/>
       </w:tblGrid>
       <w:tr>
         <w:tc>
           <w:tcPr>
-            <w:tcW w:type="dxa" w:w="8640"/>
-            <w:shd w:fill="F1F5F9"/>
+            <w:tcW w:type="dxa" w:w="9360"/>
+            <w:shd w:fill="F8FAFC"/>
             <w:tcBorders>
-              <w:top w:val="single" w:sz="4" w:space="0" w:color="CBD5E1"/>
-              <w:left w:val="single" w:sz="4" w:space="0" w:color="CBD5E1"/>
-              <w:bottom w:val="single" w:sz="4" w:space="0" w:color="CBD5E1"/>
-              <w:right w:val="single" w:sz="4" w:space="0" w:color="CBD5E1"/>
+              <w:top w:val="single" w:sz="4" w:space="0" w:color="E2E8F0"/>
+              <w:left w:val="single" w:sz="6" w:space="0" w:color="1B365D"/>
+              <!-- Deep blue left thick border -->
+              <w:bottom w:val="single" w:sz="4" w:space="0" w:color="E2E8F0"/>
+              <w:right w:val="single" w:sz="4" w:space="0" w:color="E2E8F0"/>
             </w:tcBorders>
           </w:tcPr>
           <w:p>
@@ -3489,8 +3718,8 @@
           <w:rFonts w:ascii="Calibri Light" w:hAnsi="Calibri Light"/>
           <w:b/>
           <w:i w:val="0"/>
-          <w:color w:val="1E293B"/>
-          <w:sz w:val="28"/>
+          <w:color w:val="475569"/>
+          <w:sz w:val="26"/>
         </w:rPr>
         <w:t>Source Code: pages/admin.html (Admin Portal Page)</w:t>
       </w:r>
@@ -3502,18 +3731,19 @@
         <w:tblLook w:firstColumn="1" w:firstRow="1" w:lastColumn="0" w:lastRow="0" w:noHBand="0" w:noVBand="1" w:val="04A0"/>
       </w:tblPr>
       <w:tblGrid>
-        <w:gridCol w:w="8640"/>
+        <w:gridCol w:w="9360"/>
       </w:tblGrid>
       <w:tr>
         <w:tc>
           <w:tcPr>
-            <w:tcW w:type="dxa" w:w="8640"/>
-            <w:shd w:fill="F1F5F9"/>
+            <w:tcW w:type="dxa" w:w="9360"/>
+            <w:shd w:fill="F8FAFC"/>
             <w:tcBorders>
-              <w:top w:val="single" w:sz="4" w:space="0" w:color="CBD5E1"/>
-              <w:left w:val="single" w:sz="4" w:space="0" w:color="CBD5E1"/>
-              <w:bottom w:val="single" w:sz="4" w:space="0" w:color="CBD5E1"/>
-              <w:right w:val="single" w:sz="4" w:space="0" w:color="CBD5E1"/>
+              <w:top w:val="single" w:sz="4" w:space="0" w:color="E2E8F0"/>
+              <w:left w:val="single" w:sz="6" w:space="0" w:color="1B365D"/>
+              <!-- Deep blue left thick border -->
+              <w:bottom w:val="single" w:sz="4" w:space="0" w:color="E2E8F0"/>
+              <w:right w:val="single" w:sz="4" w:space="0" w:color="E2E8F0"/>
             </w:tcBorders>
           </w:tcPr>
           <w:p>
@@ -3869,8 +4099,8 @@
           <w:rFonts w:ascii="Calibri Light" w:hAnsi="Calibri Light"/>
           <w:b/>
           <w:i w:val="0"/>
-          <w:color w:val="1E293B"/>
-          <w:sz w:val="28"/>
+          <w:color w:val="475569"/>
+          <w:sz w:val="26"/>
         </w:rPr>
         <w:t>Source Code: pages/faq.html (FAQ Page)</w:t>
       </w:r>
@@ -3882,18 +4112,19 @@
         <w:tblLook w:firstColumn="1" w:firstRow="1" w:lastColumn="0" w:lastRow="0" w:noHBand="0" w:noVBand="1" w:val="04A0"/>
       </w:tblPr>
       <w:tblGrid>
-        <w:gridCol w:w="8640"/>
+        <w:gridCol w:w="9360"/>
       </w:tblGrid>
       <w:tr>
         <w:tc>
           <w:tcPr>
-            <w:tcW w:type="dxa" w:w="8640"/>
-            <w:shd w:fill="F1F5F9"/>
+            <w:tcW w:type="dxa" w:w="9360"/>
+            <w:shd w:fill="F8FAFC"/>
             <w:tcBorders>
-              <w:top w:val="single" w:sz="4" w:space="0" w:color="CBD5E1"/>
-              <w:left w:val="single" w:sz="4" w:space="0" w:color="CBD5E1"/>
-              <w:bottom w:val="single" w:sz="4" w:space="0" w:color="CBD5E1"/>
-              <w:right w:val="single" w:sz="4" w:space="0" w:color="CBD5E1"/>
+              <w:top w:val="single" w:sz="4" w:space="0" w:color="E2E8F0"/>
+              <w:left w:val="single" w:sz="6" w:space="0" w:color="1B365D"/>
+              <!-- Deep blue left thick border -->
+              <w:bottom w:val="single" w:sz="4" w:space="0" w:color="E2E8F0"/>
+              <w:right w:val="single" w:sz="4" w:space="0" w:color="E2E8F0"/>
             </w:tcBorders>
           </w:tcPr>
           <w:p>
@@ -4218,8 +4449,8 @@
           <w:rFonts w:ascii="Calibri Light" w:hAnsi="Calibri Light"/>
           <w:b/>
           <w:i w:val="0"/>
-          <w:color w:val="1E293B"/>
-          <w:sz w:val="28"/>
+          <w:color w:val="475569"/>
+          <w:sz w:val="26"/>
         </w:rPr>
         <w:t>Source Code: pages/feedback.html (Feedback Survey Page)</w:t>
       </w:r>
@@ -4231,18 +4462,19 @@
         <w:tblLook w:firstColumn="1" w:firstRow="1" w:lastColumn="0" w:lastRow="0" w:noHBand="0" w:noVBand="1" w:val="04A0"/>
       </w:tblPr>
       <w:tblGrid>
-        <w:gridCol w:w="8640"/>
+        <w:gridCol w:w="9360"/>
       </w:tblGrid>
       <w:tr>
         <w:tc>
           <w:tcPr>
-            <w:tcW w:type="dxa" w:w="8640"/>
-            <w:shd w:fill="F1F5F9"/>
+            <w:tcW w:type="dxa" w:w="9360"/>
+            <w:shd w:fill="F8FAFC"/>
             <w:tcBorders>
-              <w:top w:val="single" w:sz="4" w:space="0" w:color="CBD5E1"/>
-              <w:left w:val="single" w:sz="4" w:space="0" w:color="CBD5E1"/>
-              <w:bottom w:val="single" w:sz="4" w:space="0" w:color="CBD5E1"/>
-              <w:right w:val="single" w:sz="4" w:space="0" w:color="CBD5E1"/>
+              <w:top w:val="single" w:sz="4" w:space="0" w:color="E2E8F0"/>
+              <w:left w:val="single" w:sz="6" w:space="0" w:color="1B365D"/>
+              <!-- Deep blue left thick border -->
+              <w:bottom w:val="single" w:sz="4" w:space="0" w:color="E2E8F0"/>
+              <w:right w:val="single" w:sz="4" w:space="0" w:color="E2E8F0"/>
             </w:tcBorders>
           </w:tcPr>
           <w:p>
@@ -4628,13 +4860,84 @@
       </w:tr>
     </w:tbl>
     <w:sectPr>
+      <w:headerReference w:type="default" r:id="rId11"/>
+      <w:footerReference w:type="default" r:id="rId12"/>
       <w:pgSz w:w="12240" w:h="15840"/>
-      <w:pgMar w:top="1440" w:right="1800" w:bottom="1440" w:left="1800" w:header="720" w:footer="720" w:gutter="0"/>
+      <w:pgMar w:top="1440" w:right="1440" w:bottom="1440" w:left="1440" w:header="720" w:footer="720" w:gutter="0"/>
       <w:cols w:space="720"/>
       <w:docGrid w:linePitch="360"/>
     </w:sectPr>
   </w:body>
 </w:document>
+</file>
+
+<file path=word/footer1.xml><?xml version="1.0" encoding="utf-8"?>
+<w:ftr xmlns:m="http://schemas.openxmlformats.org/officeDocument/2006/math" xmlns:mc="http://schemas.openxmlformats.org/markup-compatibility/2006" xmlns:mo="http://schemas.microsoft.com/office/mac/office/2008/main" xmlns:mv="urn:schemas-microsoft-com:mac:vml" xmlns:o="urn:schemas-microsoft-com:office:office" xmlns:r="http://schemas.openxmlformats.org/officeDocument/2006/relationships" xmlns:v="urn:schemas-microsoft-com:vml" xmlns:w10="urn:schemas-microsoft-com:office:word" xmlns:w14="http://schemas.microsoft.com/office/word/2010/wordml" xmlns:w="http://schemas.openxmlformats.org/wordprocessingml/2006/main" xmlns:wne="http://schemas.microsoft.com/office/word/2006/wordml" xmlns:wp14="http://schemas.microsoft.com/office/word/2010/wordprocessingDrawing" xmlns:wp="http://schemas.openxmlformats.org/drawingml/2006/wordprocessingDrawing" xmlns:wpc="http://schemas.microsoft.com/office/word/2010/wordprocessingCanvas" xmlns:wpg="http://schemas.microsoft.com/office/word/2010/wordprocessingGroup" xmlns:wpi="http://schemas.microsoft.com/office/word/2010/wordprocessingInk" xmlns:wps="http://schemas.microsoft.com/office/word/2010/wordprocessingShape" mc:Ignorable="w14 wp14">
+  <w:p>
+    <w:pPr>
+      <w:pStyle w:val="Footer"/>
+      <w:tabs>
+        <w:tab w:pos="9360" w:val="right"/>
+      </w:tabs>
+      <w:pBdr>
+        <w:top w:val="single" w:sz="6" w:space="4" w:color="CBD5E1"/>
+      </w:pBdr>
+    </w:pPr>
+    <w:r>
+      <w:rPr>
+        <w:rFonts w:ascii="Calibri" w:hAnsi="Calibri"/>
+        <w:b w:val="0"/>
+        <w:i w:val="0"/>
+        <w:color w:val="64748B"/>
+        <w:sz w:val="17"/>
+      </w:rPr>
+      <w:t>DEPSTAR CSE</w:t>
+      <w:tab/>
+    </w:r>
+    <w:r>
+      <w:rPr>
+        <w:rFonts w:ascii="Calibri" w:hAnsi="Calibri"/>
+        <w:b w:val="0"/>
+        <w:i w:val="0"/>
+        <w:color w:val="64748B"/>
+        <w:sz w:val="17"/>
+      </w:rPr>
+      <w:t xml:space="preserve">PAGE NO. </w:t>
+      <w:fldChar w:fldCharType="begin"/>
+      <w:instrText xml:space="preserve"> PAGE </w:instrText>
+      <w:fldChar w:fldCharType="separate"/>
+      <w:fldChar w:fldCharType="end"/>
+    </w:r>
+  </w:p>
+</w:ftr>
+</file>
+
+<file path=word/header1.xml><?xml version="1.0" encoding="utf-8"?>
+<w:hdr xmlns:m="http://schemas.openxmlformats.org/officeDocument/2006/math" xmlns:mc="http://schemas.openxmlformats.org/markup-compatibility/2006" xmlns:mo="http://schemas.microsoft.com/office/mac/office/2008/main" xmlns:mv="urn:schemas-microsoft-com:mac:vml" xmlns:o="urn:schemas-microsoft-com:office:office" xmlns:r="http://schemas.openxmlformats.org/officeDocument/2006/relationships" xmlns:v="urn:schemas-microsoft-com:vml" xmlns:w10="urn:schemas-microsoft-com:office:word" xmlns:w14="http://schemas.microsoft.com/office/word/2010/wordml" xmlns:w="http://schemas.openxmlformats.org/wordprocessingml/2006/main" xmlns:wne="http://schemas.microsoft.com/office/word/2006/wordml" xmlns:wp14="http://schemas.microsoft.com/office/word/2010/wordprocessingDrawing" xmlns:wp="http://schemas.openxmlformats.org/drawingml/2006/wordprocessingDrawing" xmlns:wpc="http://schemas.microsoft.com/office/word/2010/wordprocessingCanvas" xmlns:wpg="http://schemas.microsoft.com/office/word/2010/wordprocessingGroup" xmlns:wpi="http://schemas.microsoft.com/office/word/2010/wordprocessingInk" xmlns:wps="http://schemas.microsoft.com/office/word/2010/wordprocessingShape" mc:Ignorable="w14 wp14">
+  <w:p>
+    <w:pPr>
+      <w:pStyle w:val="Header"/>
+      <w:tabs>
+        <w:tab w:pos="9360" w:val="right"/>
+      </w:tabs>
+      <w:pBdr>
+        <w:bottom w:val="single" w:sz="6" w:space="4" w:color="CBD5E1"/>
+      </w:pBdr>
+    </w:pPr>
+    <w:r>
+      <w:rPr>
+        <w:rFonts w:ascii="Calibri" w:hAnsi="Calibri"/>
+        <w:b w:val="0"/>
+        <w:i w:val="0"/>
+        <w:color w:val="64748B"/>
+        <w:sz w:val="17"/>
+      </w:rPr>
+      <w:t>ITUE203- WEB DEVELOPMENT FRAMEWORKS</w:t>
+      <w:tab/>
+      <w:t>25DCS058</w:t>
+    </w:r>
+  </w:p>
+</w:hdr>
 </file>
 
 <file path=word/numbering.xml><?xml version="1.0" encoding="utf-8"?>

</xml_diff>